<commit_message>
fix(HCO COP): prepared-by default, distribution dedupe, fi ligatures
- render_pre_v2: default Prepared by to Quality Coordinator; parse from draft
- dedupe COP distribution roles when owner matches accountable role
- normalize NABH PDF PUA U+F001/U+F002 (fi/fl) in emit_pre_v2 pipeline
- retrofit all 20 COP drafts/masters/previews

Co-authored-by: upadhyaymehul9-prog <upadhyaymehul9-prog@users.noreply.github.com>
</commit_message>
<xml_diff>
--- a/policies/build/masters/HCO.COP.10_v2_master.docx
+++ b/policies/build/masters/HCO.COP.10_v2_master.docx
@@ -406,7 +406,7 @@
                 <w:sz w:val="18"/>
                 <w:szCs w:val="18"/>
               </w:rPr>
-              <w:t xml:space="preserve">«Patient Rights Officer»  Name «________»</w:t>
+              <w:t xml:space="preserve">«Obstetric In-Charge»  Name «________»</w:t>
             </w:r>
           </w:p>
         </w:tc>
@@ -827,7 +827,7 @@
           <w:sz w:val="22"/>
           <w:szCs w:val="22"/>
         </w:rPr>
-        <w:t xml:space="preserve">2. Do not skip: The organisation identies and, provides care to high-risk obstetric cases, and where needed, refers them t...</w:t>
+        <w:t xml:space="preserve">2. Do not skip: The organisation identifies and, provides care to high-risk obstetric cases, and where needed, refers them ...</w:t>
       </w:r>
     </w:p>
     <w:p>
@@ -875,7 +875,7 @@
           <w:sz w:val="22"/>
           <w:szCs w:val="22"/>
         </w:rPr>
-        <w:t xml:space="preserve">6. Do not skip: Organisation treats pregnant woman and her companion cordially and respectfully, ensures privacy and conde...</w:t>
+        <w:t xml:space="preserve">6. Do not skip: Organisation treats pregnant woman and her companion cordially and respectfully, ensures privacy and confid...</w:t>
       </w:r>
     </w:p>
     <w:p>
@@ -935,7 +935,7 @@
           <w:sz w:val="22"/>
           <w:szCs w:val="22"/>
         </w:rPr>
-        <w:t xml:space="preserve">11. Do not skip: Organization shall adhere to legal and dened Assisted Reproductive Technology (ART) practices.</w:t>
+        <w:t xml:space="preserve">11. Do not skip: Organization shall adhere to legal and defined Assisted Reproductive Technology (ART) practices.</w:t>
       </w:r>
     </w:p>
     <w:p>
@@ -998,7 +998,7 @@
         <w:spacing w:after="100" w:before="220"/>
       </w:pPr>
       <w:r>
-        <w:t xml:space="preserve">5.2 The organisation identies and, provides care to high-risk obstetric ..</w:t>
+        <w:t xml:space="preserve">5.2 The organisation identifies and, provides care to high-risk obstetric..</w:t>
       </w:r>
     </w:p>
     <w:p>
@@ -1010,7 +1010,7 @@
           <w:sz w:val="22"/>
           <w:szCs w:val="22"/>
         </w:rPr>
-        <w:t xml:space="preserve">The organisation identies and, provides care to high-risk obstetric cases, and where needed, refers them to another appropriate centre.</w:t>
+        <w:t xml:space="preserve">The organisation identifies and, provides care to high-risk obstetric cases, and where needed, refers them to another appropriate centre.</w:t>
       </w:r>
     </w:p>
     <w:p>
@@ -1142,7 +1142,7 @@
           <w:sz w:val="22"/>
           <w:szCs w:val="22"/>
         </w:rPr>
-        <w:t xml:space="preserve">Organisation treats pregnant woman and her companion cordially and respectfully, ensures privacy and condentiality for pregnant woman during her stay.</w:t>
+        <w:t xml:space="preserve">Organisation treats pregnant woman and her companion cordially and respectfully, ensures privacy and confidentiality for pregnant woman during her stay.</w:t>
       </w:r>
     </w:p>
     <w:p>
@@ -1295,7 +1295,7 @@
         <w:spacing w:after="100" w:before="220"/>
       </w:pPr>
       <w:r>
-        <w:t xml:space="preserve">5.11 Organization shall adhere to legal and dened Assisted Reproductive T..</w:t>
+        <w:t xml:space="preserve">5.11 Organization shall adhere to legal and defined Assisted Reproductive ..</w:t>
       </w:r>
     </w:p>
     <w:p>
@@ -1307,7 +1307,7 @@
           <w:sz w:val="22"/>
           <w:szCs w:val="22"/>
         </w:rPr>
-        <w:t xml:space="preserve">Organization shall adhere to legal and dened Assisted Reproductive Technology (ART) practices.</w:t>
+        <w:t xml:space="preserve">Organization shall adhere to legal and defined Assisted Reproductive Technology (ART) practices.</w:t>
       </w:r>
     </w:p>
     <w:p>
@@ -2462,7 +2462,7 @@
           <w:sz w:val="22"/>
           <w:szCs w:val="22"/>
         </w:rPr>
-        <w:t xml:space="preserve">Medical Superintendent; Obstetric In-Charge; Quality Coordinator; department clinical staff covered by COP.10.</w:t>
+        <w:t xml:space="preserve">Medical Superintendent; Obstetric In-Charge; Quality Coordinator; department clinical staff covered by COP.10</w:t>
       </w:r>
     </w:p>
     <w:p>
@@ -2757,7 +2757,7 @@
                 <w:sz w:val="18"/>
                 <w:szCs w:val="18"/>
               </w:rPr>
-              <w:t xml:space="preserve">The organisation identies and, provides care to high-risk obstetric cases, and where needed, refers them to another appropriate centre.</w:t>
+              <w:t xml:space="preserve">The organisation identifies and, provides care to high-risk obstetric cases, and where needed, refers them to another appropriate centre.</w:t>
             </w:r>
           </w:p>
         </w:tc>
@@ -3117,7 +3117,7 @@
                 <w:sz w:val="18"/>
                 <w:szCs w:val="18"/>
               </w:rPr>
-              <w:t xml:space="preserve">Organisation treats pregnant woman and her companion cordially and respectfully, ensures privacy and condentiality for pregnant woman during her stay.</w:t>
+              <w:t xml:space="preserve">Organisation treats pregnant woman and her companion cordially and respectfully, ensures privacy and confidentiality for pregnant woman during her stay.</w:t>
             </w:r>
           </w:p>
         </w:tc>
@@ -3567,7 +3567,7 @@
                 <w:sz w:val="18"/>
                 <w:szCs w:val="18"/>
               </w:rPr>
-              <w:t xml:space="preserve">Organization shall adhere to legal and dened Assisted Reproductive Technology (ART) practices.</w:t>
+              <w:t xml:space="preserve">Organization shall adhere to legal and defined Assisted Reproductive Technology (ART) practices.</w:t>
             </w:r>
           </w:p>
         </w:tc>
@@ -3723,7 +3723,7 @@
         <w:spacing w:after="100" w:before="220"/>
       </w:pPr>
       <w:r>
-        <w:t xml:space="preserve">COP.10.b — The organisation identies and, provides care to high-risk obstetric cases, and where needed, refers them to another appropriate centre.</w:t>
+        <w:t xml:space="preserve">COP.10.b — The organisation identifies and, provides care to high-risk obstetric cases, and where needed, refers them to another appropriate centre.</w:t>
       </w:r>
     </w:p>
     <w:p>
@@ -3980,7 +3980,7 @@
         <w:spacing w:after="100" w:before="220"/>
       </w:pPr>
       <w:r>
-        <w:t xml:space="preserve">COP.10.f — Organisation treats pregnant woman and her companion cordially and respectfully, ensures privacy and condentiality for pregnant woman during her stay.</w:t>
+        <w:t xml:space="preserve">COP.10.f — Organisation treats pregnant woman and her companion cordially and respectfully, ensures privacy and confidentiality for pregnant woman during her stay.</w:t>
       </w:r>
     </w:p>
     <w:p>
@@ -4280,7 +4280,7 @@
         <w:spacing w:after="100" w:before="220"/>
       </w:pPr>
       <w:r>
-        <w:t xml:space="preserve">COP.10.k — Organization shall adhere to legal and dened Assisted Reproductive Technology (ART) practices.</w:t>
+        <w:t xml:space="preserve">COP.10.k — Organization shall adhere to legal and defined Assisted Reproductive Technology (ART) practices.</w:t>
       </w:r>
     </w:p>
     <w:p>

</xml_diff>